<commit_message>
Regenerate X12 850 PDF/DOCX to mirror .md content (excluding sample)
</commit_message>
<xml_diff>
--- a/docs/x12-850-purchase-order/files/x12-850-purchase-order.docx
+++ b/docs/x12-850-purchase-order/files/x12-850-purchase-order.docx
@@ -7,22 +7,506 @@
         <w:pStyle w:val="Heading1"/>
       </w:pPr>
       <w:r>
-        <w:t xml:space="preserve">X12 850 - Purchase Order</w:t>
-      </w:r>
-    </w:p>
-    <w:p>
-      <w:r>
-        <w:t xml:space="preserve">This is a placeholder DOCX used to test the GitHub Pages + iframe + forced-download flow for the Kong Dev Portal POC.</w:t>
-      </w:r>
-    </w:p>
-    <w:p>
-      <w:r>
-        <w:t xml:space="preserve">Transaction Set: 850 Purchase Order</w:t>
-      </w:r>
-    </w:p>
-    <w:p>
-      <w:r>
-        <w:t xml:space="preserve">Purpose: Placing an order for goods/services.</w:t>
+        <w:t xml:space="preserve">ANSI X12 850 - Purchase Order</w:t>
+      </w:r>
+    </w:p>
+    <w:p>
+      <w:pPr>
+        <w:pStyle w:val="Heading2"/>
+      </w:pPr>
+      <w:r>
+        <w:t xml:space="preserve">What it is</w:t>
+      </w:r>
+    </w:p>
+    <w:p>
+      <w:r>
+        <w:t xml:space="preserve">The X12 850 is the standard EDI transaction set used to transmit a purchase order from a buyer to a seller: what's being ordered, how much, at what price, and where it should ship.</w:t>
+      </w:r>
+    </w:p>
+    <w:p>
+      <w:r>
+        <w:t xml:space="preserve">Note: This is an original educational summary of the transaction set's structure, written from publicly known segment names/purposes. It is not a reproduction of the official ASC X12 standard, which is licensed and sold by X12.org. For a certified implementation guide, purchase the official standard from X12 or your trading partner's EDI documentation.</w:t>
+      </w:r>
+    </w:p>
+    <w:p>
+      <w:pPr>
+        <w:pStyle w:val="Heading2"/>
+      </w:pPr>
+      <w:r>
+        <w:t xml:space="preserve">Envelope structure (shared by all X12 transaction sets)</w:t>
+      </w:r>
+    </w:p>
+    <w:tbl>
+      <w:tblPr>
+        <w:tblW w:type="pct" w:w="100%"/>
+        <w:tblBorders>
+          <w:top w:val="single" w:color="auto" w:sz="4"/>
+          <w:left w:val="single" w:color="auto" w:sz="4"/>
+          <w:bottom w:val="single" w:color="auto" w:sz="4"/>
+          <w:right w:val="single" w:color="auto" w:sz="4"/>
+          <w:insideH w:val="single" w:color="auto" w:sz="4"/>
+          <w:insideV w:val="single" w:color="auto" w:sz="4"/>
+        </w:tblBorders>
+      </w:tblPr>
+      <w:tblGrid>
+        <w:gridCol w:w="100"/>
+        <w:gridCol w:w="100"/>
+        <w:gridCol w:w="100"/>
+      </w:tblGrid>
+      <w:tr>
+        <w:tc>
+          <w:p>
+            <w:r>
+              <w:t xml:space="preserve">Level</w:t>
+            </w:r>
+          </w:p>
+        </w:tc>
+        <w:tc>
+          <w:p>
+            <w:r>
+              <w:t xml:space="preserve">Segment</w:t>
+            </w:r>
+          </w:p>
+        </w:tc>
+        <w:tc>
+          <w:p>
+            <w:r>
+              <w:t xml:space="preserve">Purpose</w:t>
+            </w:r>
+          </w:p>
+        </w:tc>
+      </w:tr>
+      <w:tr>
+        <w:tc>
+          <w:p>
+            <w:r>
+              <w:t xml:space="preserve">Interchange</w:t>
+            </w:r>
+          </w:p>
+        </w:tc>
+        <w:tc>
+          <w:p>
+            <w:r>
+              <w:t xml:space="preserve">ISA</w:t>
+            </w:r>
+          </w:p>
+        </w:tc>
+        <w:tc>
+          <w:p>
+            <w:r>
+              <w:t xml:space="preserve">Interchange Control Header - sender/receiver IDs, delimiters</w:t>
+            </w:r>
+          </w:p>
+        </w:tc>
+      </w:tr>
+      <w:tr>
+        <w:tc>
+          <w:p>
+            <w:r>
+              <w:t xml:space="preserve">Functional Group</w:t>
+            </w:r>
+          </w:p>
+        </w:tc>
+        <w:tc>
+          <w:p>
+            <w:r>
+              <w:t xml:space="preserve">GS</w:t>
+            </w:r>
+          </w:p>
+        </w:tc>
+        <w:tc>
+          <w:p>
+            <w:r>
+              <w:t xml:space="preserve">Functional Group Header - groups transactions of the same type</w:t>
+            </w:r>
+          </w:p>
+        </w:tc>
+      </w:tr>
+      <w:tr>
+        <w:tc>
+          <w:p>
+            <w:r>
+              <w:t xml:space="preserve">Transaction Set</w:t>
+            </w:r>
+          </w:p>
+        </w:tc>
+        <w:tc>
+          <w:p>
+            <w:r>
+              <w:t xml:space="preserve">ST</w:t>
+            </w:r>
+          </w:p>
+        </w:tc>
+        <w:tc>
+          <w:p>
+            <w:r>
+              <w:t xml:space="preserve">Transaction Set Header - marks the start of one 850 document</w:t>
+            </w:r>
+          </w:p>
+        </w:tc>
+      </w:tr>
+      <w:tr>
+        <w:tc>
+          <w:p>
+            <w:r>
+              <w:t xml:space="preserve">...</w:t>
+            </w:r>
+          </w:p>
+        </w:tc>
+        <w:tc>
+          <w:p>
+            <w:r>
+              <w:t xml:space="preserve">...</w:t>
+            </w:r>
+          </w:p>
+        </w:tc>
+        <w:tc>
+          <w:p>
+            <w:r>
+              <w:t xml:space="preserve">(document-specific segments, see below)</w:t>
+            </w:r>
+          </w:p>
+        </w:tc>
+      </w:tr>
+      <w:tr>
+        <w:tc>
+          <w:p>
+            <w:r>
+              <w:t xml:space="preserve">Transaction Set</w:t>
+            </w:r>
+          </w:p>
+        </w:tc>
+        <w:tc>
+          <w:p>
+            <w:r>
+              <w:t xml:space="preserve">SE</w:t>
+            </w:r>
+          </w:p>
+        </w:tc>
+        <w:tc>
+          <w:p>
+            <w:r>
+              <w:t xml:space="preserve">Transaction Set Trailer - segment count, control number</w:t>
+            </w:r>
+          </w:p>
+        </w:tc>
+      </w:tr>
+      <w:tr>
+        <w:tc>
+          <w:p>
+            <w:r>
+              <w:t xml:space="preserve">Functional Group</w:t>
+            </w:r>
+          </w:p>
+        </w:tc>
+        <w:tc>
+          <w:p>
+            <w:r>
+              <w:t xml:space="preserve">GE</w:t>
+            </w:r>
+          </w:p>
+        </w:tc>
+        <w:tc>
+          <w:p>
+            <w:r>
+              <w:t xml:space="preserve">Functional Group Trailer</w:t>
+            </w:r>
+          </w:p>
+        </w:tc>
+      </w:tr>
+      <w:tr>
+        <w:tc>
+          <w:p>
+            <w:r>
+              <w:t xml:space="preserve">Interchange</w:t>
+            </w:r>
+          </w:p>
+        </w:tc>
+        <w:tc>
+          <w:p>
+            <w:r>
+              <w:t xml:space="preserve">IEA</w:t>
+            </w:r>
+          </w:p>
+        </w:tc>
+        <w:tc>
+          <w:p>
+            <w:r>
+              <w:t xml:space="preserve">Interchange Control Trailer</w:t>
+            </w:r>
+          </w:p>
+        </w:tc>
+      </w:tr>
+    </w:tbl>
+    <w:p>
+      <w:pPr>
+        <w:pStyle w:val="Heading2"/>
+        <w:spacing w:before="200"/>
+      </w:pPr>
+      <w:r>
+        <w:t xml:space="preserve">850-specific segments</w:t>
+      </w:r>
+    </w:p>
+    <w:tbl>
+      <w:tblPr>
+        <w:tblW w:type="pct" w:w="100%"/>
+        <w:tblBorders>
+          <w:top w:val="single" w:color="auto" w:sz="4"/>
+          <w:left w:val="single" w:color="auto" w:sz="4"/>
+          <w:bottom w:val="single" w:color="auto" w:sz="4"/>
+          <w:right w:val="single" w:color="auto" w:sz="4"/>
+          <w:insideH w:val="single" w:color="auto" w:sz="4"/>
+          <w:insideV w:val="single" w:color="auto" w:sz="4"/>
+        </w:tblBorders>
+      </w:tblPr>
+      <w:tblGrid>
+        <w:gridCol w:w="100"/>
+        <w:gridCol w:w="100"/>
+        <w:gridCol w:w="100"/>
+      </w:tblGrid>
+      <w:tr>
+        <w:tc>
+          <w:p>
+            <w:r>
+              <w:t xml:space="preserve">Segment</w:t>
+            </w:r>
+          </w:p>
+        </w:tc>
+        <w:tc>
+          <w:p>
+            <w:r>
+              <w:t xml:space="preserve">Name</w:t>
+            </w:r>
+          </w:p>
+        </w:tc>
+        <w:tc>
+          <w:p>
+            <w:r>
+              <w:t xml:space="preserve">Purpose</w:t>
+            </w:r>
+          </w:p>
+        </w:tc>
+      </w:tr>
+      <w:tr>
+        <w:tc>
+          <w:p>
+            <w:r>
+              <w:t xml:space="preserve">BEG</w:t>
+            </w:r>
+          </w:p>
+        </w:tc>
+        <w:tc>
+          <w:p>
+            <w:r>
+              <w:t xml:space="preserve">Beginning Segment for Purchase Order</w:t>
+            </w:r>
+          </w:p>
+        </w:tc>
+        <w:tc>
+          <w:p>
+            <w:r>
+              <w:t xml:space="preserve">PO number, PO type, issue date</w:t>
+            </w:r>
+          </w:p>
+        </w:tc>
+      </w:tr>
+      <w:tr>
+        <w:tc>
+          <w:p>
+            <w:r>
+              <w:t xml:space="preserve">REF</w:t>
+            </w:r>
+          </w:p>
+        </w:tc>
+        <w:tc>
+          <w:p>
+            <w:r>
+              <w:t xml:space="preserve">Reference Identification</w:t>
+            </w:r>
+          </w:p>
+        </w:tc>
+        <w:tc>
+          <w:p>
+            <w:r>
+              <w:t xml:space="preserve">Additional reference numbers (dept, contract, etc.)</w:t>
+            </w:r>
+          </w:p>
+        </w:tc>
+      </w:tr>
+      <w:tr>
+        <w:tc>
+          <w:p>
+            <w:r>
+              <w:t xml:space="preserve">PER</w:t>
+            </w:r>
+          </w:p>
+        </w:tc>
+        <w:tc>
+          <w:p>
+            <w:r>
+              <w:t xml:space="preserve">Administrative Communications Contact</w:t>
+            </w:r>
+          </w:p>
+        </w:tc>
+        <w:tc>
+          <w:p>
+            <w:r>
+              <w:t xml:space="preserve">Buyer contact info</w:t>
+            </w:r>
+          </w:p>
+        </w:tc>
+      </w:tr>
+      <w:tr>
+        <w:tc>
+          <w:p>
+            <w:r>
+              <w:t xml:space="preserve">FOB</w:t>
+            </w:r>
+          </w:p>
+        </w:tc>
+        <w:tc>
+          <w:p>
+            <w:r>
+              <w:t xml:space="preserve">F.O.B. Related Instructions</w:t>
+            </w:r>
+          </w:p>
+        </w:tc>
+        <w:tc>
+          <w:p>
+            <w:r>
+              <w:t xml:space="preserve">Shipping terms</w:t>
+            </w:r>
+          </w:p>
+        </w:tc>
+      </w:tr>
+      <w:tr>
+        <w:tc>
+          <w:p>
+            <w:r>
+              <w:t xml:space="preserve">DTM</w:t>
+            </w:r>
+          </w:p>
+        </w:tc>
+        <w:tc>
+          <w:p>
+            <w:r>
+              <w:t xml:space="preserve">Date/Time Reference</w:t>
+            </w:r>
+          </w:p>
+        </w:tc>
+        <w:tc>
+          <w:p>
+            <w:r>
+              <w:t xml:space="preserve">Requested ship / delivery dates</w:t>
+            </w:r>
+          </w:p>
+        </w:tc>
+      </w:tr>
+      <w:tr>
+        <w:tc>
+          <w:p>
+            <w:r>
+              <w:t xml:space="preserve">N1</w:t>
+            </w:r>
+          </w:p>
+        </w:tc>
+        <w:tc>
+          <w:p>
+            <w:r>
+              <w:t xml:space="preserve">Name</w:t>
+            </w:r>
+          </w:p>
+        </w:tc>
+        <w:tc>
+          <w:p>
+            <w:r>
+              <w:t xml:space="preserve">Party identification (Buyer, Vendor, Ship-To), often looped</w:t>
+            </w:r>
+          </w:p>
+        </w:tc>
+      </w:tr>
+      <w:tr>
+        <w:tc>
+          <w:p>
+            <w:r>
+              <w:t xml:space="preserve">PO1</w:t>
+            </w:r>
+          </w:p>
+        </w:tc>
+        <w:tc>
+          <w:p>
+            <w:r>
+              <w:t xml:space="preserve">Baseline Item Data</w:t>
+            </w:r>
+          </w:p>
+        </w:tc>
+        <w:tc>
+          <w:p>
+            <w:r>
+              <w:t xml:space="preserve">One line item: SKU, quantity, unit price, UOM</w:t>
+            </w:r>
+          </w:p>
+        </w:tc>
+      </w:tr>
+      <w:tr>
+        <w:tc>
+          <w:p>
+            <w:r>
+              <w:t xml:space="preserve">PID</w:t>
+            </w:r>
+          </w:p>
+        </w:tc>
+        <w:tc>
+          <w:p>
+            <w:r>
+              <w:t xml:space="preserve">Product/Item Description</w:t>
+            </w:r>
+          </w:p>
+        </w:tc>
+        <w:tc>
+          <w:p>
+            <w:r>
+              <w:t xml:space="preserve">Free-text description of the line item</w:t>
+            </w:r>
+          </w:p>
+        </w:tc>
+      </w:tr>
+      <w:tr>
+        <w:tc>
+          <w:p>
+            <w:r>
+              <w:t xml:space="preserve">CTT</w:t>
+            </w:r>
+          </w:p>
+        </w:tc>
+        <w:tc>
+          <w:p>
+            <w:r>
+              <w:t xml:space="preserve">Transaction Totals</w:t>
+            </w:r>
+          </w:p>
+        </w:tc>
+        <w:tc>
+          <w:p>
+            <w:r>
+              <w:t xml:space="preserve">Count of line items in the transaction</w:t>
+            </w:r>
+          </w:p>
+        </w:tc>
+      </w:tr>
+    </w:tbl>
+    <w:p>
+      <w:pPr>
+        <w:pStyle w:val="Heading2"/>
+        <w:spacing w:before="200"/>
+      </w:pPr>
+      <w:r>
+        <w:t xml:space="preserve">Mapping to a modern REST equivalent</w:t>
+      </w:r>
+    </w:p>
+    <w:p>
+      <w:r>
+        <w:t xml:space="preserve">This structure maps naturally onto a JSON PurchaseOrder payload: BEG -&gt; order header fields, N1 loop -&gt; a businessEntity array (buyer/vendor/ship-to), PO1/PID loop -&gt; an itemDetail array, CTT -&gt; a derived count rather than a transmitted field.</w:t>
       </w:r>
     </w:p>
     <w:sectPr>

</xml_diff>